<commit_message>
final version report + requirements updated
</commit_message>
<xml_diff>
--- a/report/Credit_Score_Classification_Report_v2.docx
+++ b/report/Credit_Score_Classification_Report_v2.docx
@@ -6446,7 +6446,7 @@
           <w:color w:val="auto"/>
           <w:sz w:val="24"/>
         </w:rPr>
-        <w:t>Annual_Income</w:t>
+        <w:t>Monthly_Balance</w:t>
       </w:r>
       <w:proofErr w:type="spellEnd"/>
       <w:r>
@@ -6455,6 +6455,66 @@
           <w:color w:val="auto"/>
           <w:sz w:val="24"/>
         </w:rPr>
+        <w:t xml:space="preserve"> </w:t>
+      </w:r>
+      <w:r>
+        <w:rPr>
+          <w:rFonts w:ascii="Times New Roman" w:hAnsi="Times New Roman" w:cs="Times New Roman"/>
+          <w:color w:val="auto"/>
+          <w:sz w:val="24"/>
+        </w:rPr>
+        <w:t xml:space="preserve">and </w:t>
+      </w:r>
+      <w:proofErr w:type="spellStart"/>
+      <w:r>
+        <w:rPr>
+          <w:rFonts w:ascii="Times New Roman" w:hAnsi="Times New Roman" w:cs="Times New Roman"/>
+          <w:color w:val="auto"/>
+          <w:sz w:val="24"/>
+        </w:rPr>
+        <w:t>Monthly_Inhand_Salary</w:t>
+      </w:r>
+      <w:proofErr w:type="spellEnd"/>
+      <w:r>
+        <w:rPr>
+          <w:rFonts w:ascii="Times New Roman" w:hAnsi="Times New Roman" w:cs="Times New Roman"/>
+          <w:color w:val="auto"/>
+          <w:sz w:val="24"/>
+        </w:rPr>
+        <w:t xml:space="preserve"> (r = 0.</w:t>
+      </w:r>
+      <w:r>
+        <w:rPr>
+          <w:rFonts w:ascii="Times New Roman" w:hAnsi="Times New Roman" w:cs="Times New Roman"/>
+          <w:color w:val="auto"/>
+          <w:sz w:val="24"/>
+        </w:rPr>
+        <w:t>67</w:t>
+      </w:r>
+      <w:r>
+        <w:rPr>
+          <w:rFonts w:ascii="Times New Roman" w:hAnsi="Times New Roman" w:cs="Times New Roman"/>
+          <w:color w:val="auto"/>
+          <w:sz w:val="24"/>
+        </w:rPr>
+        <w:t xml:space="preserve">), expected given their mathematical relationship. </w:t>
+      </w:r>
+      <w:proofErr w:type="spellStart"/>
+      <w:r>
+        <w:rPr>
+          <w:rFonts w:ascii="Times New Roman" w:hAnsi="Times New Roman" w:cs="Times New Roman"/>
+          <w:color w:val="auto"/>
+          <w:sz w:val="24"/>
+        </w:rPr>
+        <w:t>Amount_invested_monthly</w:t>
+      </w:r>
+      <w:proofErr w:type="spellEnd"/>
+      <w:r>
+        <w:rPr>
+          <w:rFonts w:ascii="Times New Roman" w:hAnsi="Times New Roman" w:cs="Times New Roman"/>
+          <w:color w:val="auto"/>
+          <w:sz w:val="24"/>
+        </w:rPr>
         <w:t xml:space="preserve"> and </w:t>
       </w:r>
       <w:proofErr w:type="spellStart"/>
@@ -6464,7 +6524,7 @@
           <w:color w:val="auto"/>
           <w:sz w:val="24"/>
         </w:rPr>
-        <w:t>Monthly_Inhand_Salary</w:t>
+        <w:t>Montly_Inhand_Salary</w:t>
       </w:r>
       <w:proofErr w:type="spellEnd"/>
       <w:r>
@@ -6473,7 +6533,23 @@
           <w:color w:val="auto"/>
           <w:sz w:val="24"/>
         </w:rPr>
-        <w:t xml:space="preserve"> (r = 0.92), expected given their mathematical relationship. </w:t>
+        <w:t xml:space="preserve"> show moderate correlation (r = </w:t>
+      </w:r>
+      <w:r>
+        <w:rPr>
+          <w:rFonts w:ascii="Times New Roman" w:hAnsi="Times New Roman" w:cs="Times New Roman"/>
+          <w:color w:val="auto"/>
+          <w:sz w:val="24"/>
+        </w:rPr>
+        <w:t>0.59</w:t>
+      </w:r>
+      <w:r>
+        <w:rPr>
+          <w:rFonts w:ascii="Times New Roman" w:hAnsi="Times New Roman" w:cs="Times New Roman"/>
+          <w:color w:val="auto"/>
+          <w:sz w:val="24"/>
+        </w:rPr>
+        <w:t xml:space="preserve">), while </w:t>
       </w:r>
       <w:proofErr w:type="spellStart"/>
       <w:r>
@@ -6482,7 +6558,7 @@
           <w:color w:val="auto"/>
           <w:sz w:val="24"/>
         </w:rPr>
-        <w:t>Interest_Rate</w:t>
+        <w:t>Outstanding_Debt</w:t>
       </w:r>
       <w:proofErr w:type="spellEnd"/>
       <w:r>
@@ -6491,7 +6567,7 @@
           <w:color w:val="auto"/>
           <w:sz w:val="24"/>
         </w:rPr>
-        <w:t xml:space="preserve"> and </w:t>
+        <w:t xml:space="preserve"> correlates with both </w:t>
       </w:r>
       <w:proofErr w:type="spellStart"/>
       <w:r>
@@ -6500,7 +6576,7 @@
           <w:color w:val="auto"/>
           <w:sz w:val="24"/>
         </w:rPr>
-        <w:t>Num_of_Loan</w:t>
+        <w:t>Delay_from_due_rate</w:t>
       </w:r>
       <w:proofErr w:type="spellEnd"/>
       <w:r>
@@ -6509,62 +6585,26 @@
           <w:color w:val="auto"/>
           <w:sz w:val="24"/>
         </w:rPr>
-        <w:t xml:space="preserve"> show moderate correlation (r = 0.47), while </w:t>
-      </w:r>
-      <w:proofErr w:type="spellStart"/>
-      <w:r>
-        <w:rPr>
-          <w:rFonts w:ascii="Times New Roman" w:hAnsi="Times New Roman" w:cs="Times New Roman"/>
-          <w:color w:val="auto"/>
-          <w:sz w:val="24"/>
-        </w:rPr>
-        <w:t>Outstanding_Debt</w:t>
-      </w:r>
-      <w:proofErr w:type="spellEnd"/>
-      <w:r>
-        <w:rPr>
-          <w:rFonts w:ascii="Times New Roman" w:hAnsi="Times New Roman" w:cs="Times New Roman"/>
-          <w:color w:val="auto"/>
-          <w:sz w:val="24"/>
-        </w:rPr>
-        <w:t xml:space="preserve"> correlates with both </w:t>
-      </w:r>
-      <w:proofErr w:type="spellStart"/>
-      <w:r>
-        <w:rPr>
-          <w:rFonts w:ascii="Times New Roman" w:hAnsi="Times New Roman" w:cs="Times New Roman"/>
-          <w:color w:val="auto"/>
-          <w:sz w:val="24"/>
-        </w:rPr>
-        <w:t>Interest_Rate</w:t>
-      </w:r>
-      <w:proofErr w:type="spellEnd"/>
-      <w:r>
-        <w:rPr>
-          <w:rFonts w:ascii="Times New Roman" w:hAnsi="Times New Roman" w:cs="Times New Roman"/>
-          <w:color w:val="auto"/>
-          <w:sz w:val="24"/>
-        </w:rPr>
-        <w:t xml:space="preserve"> (r = 0.43) and </w:t>
-      </w:r>
-      <w:proofErr w:type="spellStart"/>
-      <w:r>
-        <w:rPr>
-          <w:rFonts w:ascii="Times New Roman" w:hAnsi="Times New Roman" w:cs="Times New Roman"/>
-          <w:color w:val="auto"/>
-          <w:sz w:val="24"/>
-        </w:rPr>
-        <w:t>Num_of_Loan</w:t>
-      </w:r>
-      <w:proofErr w:type="spellEnd"/>
-      <w:r>
-        <w:rPr>
-          <w:rFonts w:ascii="Times New Roman" w:hAnsi="Times New Roman" w:cs="Times New Roman"/>
-          <w:color w:val="auto"/>
-          <w:sz w:val="24"/>
-        </w:rPr>
-        <w:t xml:space="preserve"> (r = 0.39), forming a cluster of debt-burden indicators. </w:t>
-      </w:r>
+        <w:t xml:space="preserve"> (r = 0</w:t>
+      </w:r>
+      <w:r>
+        <w:rPr>
+          <w:rFonts w:ascii="Times New Roman" w:hAnsi="Times New Roman" w:cs="Times New Roman"/>
+          <w:color w:val="auto"/>
+          <w:sz w:val="24"/>
+        </w:rPr>
+        <w:t>.57</w:t>
+      </w:r>
+      <w:r>
+        <w:rPr>
+          <w:rFonts w:ascii="Times New Roman" w:hAnsi="Times New Roman" w:cs="Times New Roman"/>
+          <w:color w:val="auto"/>
+          <w:sz w:val="24"/>
+        </w:rPr>
+        <w:t xml:space="preserve">). </w:t>
+      </w:r>
+      <w:bookmarkStart w:id="16" w:name="_GoBack"/>
+      <w:bookmarkEnd w:id="16"/>
       <w:proofErr w:type="spellStart"/>
       <w:r>
         <w:rPr>
@@ -6655,11 +6695,11 @@
         <w:pStyle w:val="Heading2"/>
         <w:spacing w:line="250" w:lineRule="auto"/>
       </w:pPr>
-      <w:bookmarkStart w:id="16" w:name="_Toc226582352"/>
+      <w:bookmarkStart w:id="17" w:name="_Toc226582352"/>
       <w:r>
         <w:t>4.5 Key Feature-Target Relationships</w:t>
       </w:r>
-      <w:bookmarkEnd w:id="16"/>
+      <w:bookmarkEnd w:id="17"/>
     </w:p>
     <w:p>
       <w:pPr>
@@ -7225,11 +7265,11 @@
         <w:pStyle w:val="Heading2"/>
         <w:spacing w:line="250" w:lineRule="auto"/>
       </w:pPr>
-      <w:bookmarkStart w:id="17" w:name="_Toc226582353"/>
+      <w:bookmarkStart w:id="18" w:name="_Toc226582353"/>
       <w:r>
         <w:t>4.6 Loan Type Analysis</w:t>
       </w:r>
-      <w:bookmarkEnd w:id="17"/>
+      <w:bookmarkEnd w:id="18"/>
     </w:p>
     <w:p>
       <w:pPr>
@@ -7404,22 +7444,22 @@
         <w:pStyle w:val="Heading1"/>
         <w:spacing w:line="250" w:lineRule="auto"/>
       </w:pPr>
-      <w:bookmarkStart w:id="18" w:name="_Toc226582354"/>
+      <w:bookmarkStart w:id="19" w:name="_Toc226582354"/>
       <w:r>
         <w:t>5. Prediction and Modeling</w:t>
       </w:r>
-      <w:bookmarkEnd w:id="18"/>
+      <w:bookmarkEnd w:id="19"/>
     </w:p>
     <w:p>
       <w:pPr>
         <w:pStyle w:val="Heading2"/>
         <w:spacing w:line="250" w:lineRule="auto"/>
       </w:pPr>
-      <w:bookmarkStart w:id="19" w:name="_Toc226582355"/>
+      <w:bookmarkStart w:id="20" w:name="_Toc226582355"/>
       <w:r>
         <w:t>5.1 Feature Encoding and Scaling</w:t>
       </w:r>
-      <w:bookmarkEnd w:id="19"/>
+      <w:bookmarkEnd w:id="20"/>
     </w:p>
     <w:p>
       <w:pPr>
@@ -8295,11 +8335,11 @@
         <w:pStyle w:val="Heading2"/>
         <w:spacing w:line="250" w:lineRule="auto"/>
       </w:pPr>
-      <w:bookmarkStart w:id="20" w:name="_Toc226582356"/>
+      <w:bookmarkStart w:id="21" w:name="_Toc226582356"/>
       <w:r>
         <w:t>5.2 Train/Test Split</w:t>
       </w:r>
-      <w:bookmarkEnd w:id="20"/>
+      <w:bookmarkEnd w:id="21"/>
     </w:p>
     <w:p>
       <w:pPr>
@@ -8325,11 +8365,11 @@
         <w:pStyle w:val="Heading2"/>
         <w:spacing w:line="250" w:lineRule="auto"/>
       </w:pPr>
-      <w:bookmarkStart w:id="21" w:name="_Toc226582357"/>
+      <w:bookmarkStart w:id="22" w:name="_Toc226582357"/>
       <w:r>
         <w:t>5.3 Model Selection</w:t>
       </w:r>
-      <w:bookmarkEnd w:id="21"/>
+      <w:bookmarkEnd w:id="22"/>
     </w:p>
     <w:p>
       <w:pPr>
@@ -9116,11 +9156,11 @@
         <w:pStyle w:val="Heading2"/>
         <w:spacing w:line="250" w:lineRule="auto"/>
       </w:pPr>
-      <w:bookmarkStart w:id="22" w:name="_Toc226582358"/>
+      <w:bookmarkStart w:id="23" w:name="_Toc226582358"/>
       <w:r>
         <w:t>5.4 Evaluation Methodology</w:t>
       </w:r>
-      <w:bookmarkEnd w:id="22"/>
+      <w:bookmarkEnd w:id="23"/>
     </w:p>
     <w:p>
       <w:pPr>
@@ -9164,22 +9204,22 @@
         <w:pStyle w:val="Heading1"/>
         <w:spacing w:line="250" w:lineRule="auto"/>
       </w:pPr>
-      <w:bookmarkStart w:id="23" w:name="_Toc226582359"/>
+      <w:bookmarkStart w:id="24" w:name="_Toc226582359"/>
       <w:r>
         <w:t>6. Results and Discussion</w:t>
       </w:r>
-      <w:bookmarkEnd w:id="23"/>
+      <w:bookmarkEnd w:id="24"/>
     </w:p>
     <w:p>
       <w:pPr>
         <w:pStyle w:val="Heading2"/>
         <w:spacing w:line="250" w:lineRule="auto"/>
       </w:pPr>
-      <w:bookmarkStart w:id="24" w:name="_Toc226582360"/>
+      <w:bookmarkStart w:id="25" w:name="_Toc226582360"/>
       <w:r>
         <w:t>6.1 Benchmark Comparison</w:t>
       </w:r>
-      <w:bookmarkEnd w:id="24"/>
+      <w:bookmarkEnd w:id="25"/>
     </w:p>
     <w:p>
       <w:pPr>
@@ -10486,11 +10526,11 @@
         <w:pStyle w:val="Heading2"/>
         <w:spacing w:line="250" w:lineRule="auto"/>
       </w:pPr>
-      <w:bookmarkStart w:id="25" w:name="_Toc226582361"/>
+      <w:bookmarkStart w:id="26" w:name="_Toc226582361"/>
       <w:r>
         <w:t>6.2 Per-Class Performance Analysis</w:t>
       </w:r>
-      <w:bookmarkEnd w:id="25"/>
+      <w:bookmarkEnd w:id="26"/>
     </w:p>
     <w:p>
       <w:pPr>
@@ -10516,11 +10556,11 @@
         <w:pStyle w:val="Heading2"/>
         <w:spacing w:line="250" w:lineRule="auto"/>
       </w:pPr>
-      <w:bookmarkStart w:id="26" w:name="_Toc226582362"/>
+      <w:bookmarkStart w:id="27" w:name="_Toc226582362"/>
       <w:r>
         <w:t>6.2.1 KNN Performance</w:t>
       </w:r>
-      <w:bookmarkEnd w:id="26"/>
+      <w:bookmarkEnd w:id="27"/>
     </w:p>
     <w:p>
       <w:pPr>
@@ -10693,11 +10733,11 @@
         <w:pStyle w:val="Heading2"/>
         <w:spacing w:line="250" w:lineRule="auto"/>
       </w:pPr>
-      <w:bookmarkStart w:id="27" w:name="_Toc226582363"/>
+      <w:bookmarkStart w:id="28" w:name="_Toc226582363"/>
       <w:r>
         <w:t>6.2.2 Random Forest Performance</w:t>
       </w:r>
-      <w:bookmarkEnd w:id="27"/>
+      <w:bookmarkEnd w:id="28"/>
     </w:p>
     <w:p>
       <w:pPr>
@@ -10854,7 +10894,7 @@
         <w:pStyle w:val="Heading2"/>
         <w:spacing w:line="250" w:lineRule="auto"/>
       </w:pPr>
-      <w:bookmarkStart w:id="28" w:name="_Toc226582364"/>
+      <w:bookmarkStart w:id="29" w:name="_Toc226582364"/>
       <w:r>
         <w:t xml:space="preserve">6.2.3 </w:t>
       </w:r>
@@ -10866,7 +10906,7 @@
       <w:r>
         <w:t xml:space="preserve"> Performance</w:t>
       </w:r>
-      <w:bookmarkEnd w:id="28"/>
+      <w:bookmarkEnd w:id="29"/>
     </w:p>
     <w:p>
       <w:pPr>
@@ -11077,7 +11117,7 @@
         <w:pStyle w:val="Heading2"/>
         <w:spacing w:line="250" w:lineRule="auto"/>
       </w:pPr>
-      <w:bookmarkStart w:id="29" w:name="_Toc226582365"/>
+      <w:bookmarkStart w:id="30" w:name="_Toc226582365"/>
       <w:r>
         <w:t xml:space="preserve">6.2.4 </w:t>
       </w:r>
@@ -11089,7 +11129,7 @@
       <w:r>
         <w:t xml:space="preserve"> Performance</w:t>
       </w:r>
-      <w:bookmarkEnd w:id="29"/>
+      <w:bookmarkEnd w:id="30"/>
     </w:p>
     <w:p>
       <w:pPr>
@@ -11318,11 +11358,11 @@
         <w:pStyle w:val="Heading2"/>
         <w:spacing w:line="250" w:lineRule="auto"/>
       </w:pPr>
-      <w:bookmarkStart w:id="30" w:name="_Toc226582366"/>
+      <w:bookmarkStart w:id="31" w:name="_Toc226582366"/>
       <w:r>
         <w:t>6.3 Confusion Matrix Comparison</w:t>
       </w:r>
-      <w:bookmarkEnd w:id="30"/>
+      <w:bookmarkEnd w:id="31"/>
     </w:p>
     <w:p>
       <w:pPr>
@@ -11453,11 +11493,11 @@
         <w:pStyle w:val="Heading2"/>
         <w:spacing w:line="250" w:lineRule="auto"/>
       </w:pPr>
-      <w:bookmarkStart w:id="31" w:name="_Toc226582367"/>
+      <w:bookmarkStart w:id="32" w:name="_Toc226582367"/>
       <w:r>
         <w:t>6.4 Training Efficiency Analysis</w:t>
       </w:r>
-      <w:bookmarkEnd w:id="31"/>
+      <w:bookmarkEnd w:id="32"/>
     </w:p>
     <w:p>
       <w:pPr>
@@ -12375,11 +12415,11 @@
         <w:pStyle w:val="Heading2"/>
         <w:spacing w:line="250" w:lineRule="auto"/>
       </w:pPr>
-      <w:bookmarkStart w:id="32" w:name="_Toc226582368"/>
+      <w:bookmarkStart w:id="33" w:name="_Toc226582368"/>
       <w:r>
         <w:t>6.5 Discussion and Interpretation</w:t>
       </w:r>
-      <w:bookmarkEnd w:id="32"/>
+      <w:bookmarkEnd w:id="33"/>
     </w:p>
     <w:p>
       <w:pPr>
@@ -12651,22 +12691,22 @@
         <w:pStyle w:val="Heading1"/>
         <w:spacing w:line="250" w:lineRule="auto"/>
       </w:pPr>
-      <w:bookmarkStart w:id="33" w:name="_Toc226582369"/>
+      <w:bookmarkStart w:id="34" w:name="_Toc226582369"/>
       <w:r>
         <w:t>7. Conclusions</w:t>
       </w:r>
-      <w:bookmarkEnd w:id="33"/>
+      <w:bookmarkEnd w:id="34"/>
     </w:p>
     <w:p>
       <w:pPr>
         <w:pStyle w:val="Heading2"/>
         <w:spacing w:line="250" w:lineRule="auto"/>
       </w:pPr>
-      <w:bookmarkStart w:id="34" w:name="_Toc226582370"/>
+      <w:bookmarkStart w:id="35" w:name="_Toc226582370"/>
       <w:r>
         <w:t>7.1 Key Findings</w:t>
       </w:r>
-      <w:bookmarkEnd w:id="34"/>
+      <w:bookmarkEnd w:id="35"/>
     </w:p>
     <w:p>
       <w:pPr>
@@ -12853,11 +12893,11 @@
         <w:pStyle w:val="Heading2"/>
         <w:spacing w:line="250" w:lineRule="auto"/>
       </w:pPr>
-      <w:bookmarkStart w:id="35" w:name="_Toc226582371"/>
+      <w:bookmarkStart w:id="36" w:name="_Toc226582371"/>
       <w:r>
         <w:t>7.2 Hypotheses Evaluation</w:t>
       </w:r>
-      <w:bookmarkEnd w:id="35"/>
+      <w:bookmarkEnd w:id="36"/>
     </w:p>
     <w:tbl>
       <w:tblPr>
@@ -13796,11 +13836,11 @@
         <w:pStyle w:val="Heading2"/>
         <w:spacing w:line="250" w:lineRule="auto"/>
       </w:pPr>
-      <w:bookmarkStart w:id="36" w:name="_Toc226582372"/>
+      <w:bookmarkStart w:id="37" w:name="_Toc226582372"/>
       <w:r>
         <w:t>7.3 Practical Recommendations</w:t>
       </w:r>
-      <w:bookmarkEnd w:id="36"/>
+      <w:bookmarkEnd w:id="37"/>
     </w:p>
     <w:p>
       <w:pPr>
@@ -13963,11 +14003,11 @@
         <w:pStyle w:val="Heading2"/>
         <w:spacing w:line="250" w:lineRule="auto"/>
       </w:pPr>
-      <w:bookmarkStart w:id="37" w:name="_Toc226582373"/>
+      <w:bookmarkStart w:id="38" w:name="_Toc226582373"/>
       <w:r>
         <w:t>7.4 Limitations</w:t>
       </w:r>
-      <w:bookmarkEnd w:id="37"/>
+      <w:bookmarkEnd w:id="38"/>
     </w:p>
     <w:p>
       <w:pPr>
@@ -14068,11 +14108,11 @@
         </w:numPr>
         <w:spacing w:line="250" w:lineRule="auto"/>
       </w:pPr>
-      <w:bookmarkStart w:id="38" w:name="_Toc226582374"/>
+      <w:bookmarkStart w:id="39" w:name="_Toc226582374"/>
       <w:r>
         <w:t>Future Work</w:t>
       </w:r>
-      <w:bookmarkEnd w:id="38"/>
+      <w:bookmarkEnd w:id="39"/>
     </w:p>
     <w:p>
       <w:pPr>
@@ -14225,17 +14265,7 @@
           <w:color w:val="auto"/>
           <w:sz w:val="24"/>
         </w:rPr>
-        <w:t>Explainable AI (XAI): Implement SHAP and LIME for model inter</w:t>
-      </w:r>
-      <w:bookmarkStart w:id="39" w:name="_GoBack"/>
-      <w:bookmarkEnd w:id="39"/>
-      <w:r>
-        <w:rPr>
-          <w:rFonts w:ascii="Times New Roman" w:hAnsi="Times New Roman" w:cs="Times New Roman"/>
-          <w:color w:val="auto"/>
-          <w:sz w:val="24"/>
-        </w:rPr>
-        <w:t>pretability.</w:t>
+        <w:t>Explainable AI (XAI): Implement SHAP and LIME for model interpretability.</w:t>
       </w:r>
     </w:p>
     <w:p>
@@ -14245,13 +14275,7 @@
       </w:pPr>
       <w:r>
         <w:lastRenderedPageBreak/>
-        <w:t>8</w:t>
-      </w:r>
-      <w:r>
-        <w:t xml:space="preserve">. </w:t>
-      </w:r>
-      <w:r>
-        <w:t>References</w:t>
+        <w:t>8. References</w:t>
       </w:r>
     </w:p>
     <w:p>

</xml_diff>